<commit_message>
Cap nhat tai lieu tuan 4 va dong bo ma nguon
</commit_message>
<xml_diff>
--- a/docs/tuan3/PHAN1_KIEN_TRUC_API.docx
+++ b/docs/tuan3/PHAN1_KIEN_TRUC_API.docx
@@ -4449,7 +4449,7 @@
                 <w:i w:val="0"/>
                 <w:sz w:val="20"/>
               </w:rPr>
-              <w:t>{co_blur, che_do_vung, vung, luu_nhom}</w:t>
+              <w:t>{co_blur, vung, luu_nhom}</w:t>
             </w:r>
           </w:p>
         </w:tc>
@@ -4468,7 +4468,7 @@
                 <w:i w:val="0"/>
                 <w:sz w:val="20"/>
               </w:rPr>
-              <w:t>{id, trang_thai: "cho", vung, che_do_vung}</w:t>
+              <w:t>{id, trang_thai: "cho", vung}</w:t>
             </w:r>
           </w:p>
         </w:tc>
@@ -4719,7 +4719,7 @@
                 <w:i w:val="0"/>
                 <w:sz w:val="20"/>
               </w:rPr>
-              <w:t>{goc, dich, khoa}</w:t>
+              <w:t>{goc, dich}</w:t>
             </w:r>
           </w:p>
         </w:tc>
@@ -4972,16 +4972,7 @@
                 <w:i w:val="0"/>
                 <w:sz w:val="22"/>
               </w:rPr>
-              <w:t xml:space="preserve">Sai đuôi tệp, tệp rỗng, quá 4 GiB, ffprobe không đọc được, hộp vượt khung, chỉ số câu không tồn tại, </w:t>
-            </w:r>
-            <w:r>
-              <w:rPr>
-                <w:rFonts w:ascii="Consolas" w:hAnsi="Consolas" w:eastAsia="Consolas"/>
-                <w:b w:val="0"/>
-                <w:i w:val="0"/>
-                <w:sz w:val="20"/>
-              </w:rPr>
-              <w:t>che_do_vung: null</w:t>
+              <w:t>Sai đuôi tệp, tệp rỗng, quá 4 GiB, ffprobe không đọc được, hộp vượt khung, chỉ số câu không tồn tại</w:t>
             </w:r>
           </w:p>
         </w:tc>
@@ -6361,7 +6352,7 @@
       <w:r>
         <w:drawing>
           <wp:inline xmlns:a="http://schemas.openxmlformats.org/drawingml/2006/main" xmlns:pic="http://schemas.openxmlformats.org/drawingml/2006/picture">
-            <wp:extent cx="5760000" cy="3160884"/>
+            <wp:extent cx="5760000" cy="3134668"/>
             <wp:docPr id="2" name="Picture 2"/>
             <wp:cNvGraphicFramePr>
               <a:graphicFrameLocks noChangeAspect="1"/>
@@ -6382,7 +6373,7 @@
                   <pic:spPr>
                     <a:xfrm>
                       <a:off x="0" y="0"/>
-                      <a:ext cx="5760000" cy="3160884"/>
+                      <a:ext cx="5760000" cy="3134668"/>
                     </a:xfrm>
                     <a:prstGeom prst="rect"/>
                   </pic:spPr>

</xml_diff>

<commit_message>
Cap nhat README/CLAUDE.md, tai lieu tuan 4 va dong bo ma nguon
</commit_message>
<xml_diff>
--- a/docs/tuan3/PHAN1_KIEN_TRUC_API.docx
+++ b/docs/tuan3/PHAN1_KIEN_TRUC_API.docx
@@ -4449,7 +4449,7 @@
                 <w:i w:val="0"/>
                 <w:sz w:val="20"/>
               </w:rPr>
-              <w:t>{co_blur, che_do_vung, vung, luu_nhom}</w:t>
+              <w:t>{co_blur, vung, luu_nhom}</w:t>
             </w:r>
           </w:p>
         </w:tc>
@@ -4468,7 +4468,7 @@
                 <w:i w:val="0"/>
                 <w:sz w:val="20"/>
               </w:rPr>
-              <w:t>{id, trang_thai: "cho", vung, che_do_vung}</w:t>
+              <w:t>{id, trang_thai: "cho", vung}</w:t>
             </w:r>
           </w:p>
         </w:tc>
@@ -4719,7 +4719,7 @@
                 <w:i w:val="0"/>
                 <w:sz w:val="20"/>
               </w:rPr>
-              <w:t>{goc, dich, khoa}</w:t>
+              <w:t>{goc, dich}</w:t>
             </w:r>
           </w:p>
         </w:tc>
@@ -4972,16 +4972,7 @@
                 <w:i w:val="0"/>
                 <w:sz w:val="22"/>
               </w:rPr>
-              <w:t xml:space="preserve">Sai đuôi tệp, tệp rỗng, quá 4 GiB, ffprobe không đọc được, hộp vượt khung, chỉ số câu không tồn tại, </w:t>
-            </w:r>
-            <w:r>
-              <w:rPr>
-                <w:rFonts w:ascii="Consolas" w:hAnsi="Consolas" w:eastAsia="Consolas"/>
-                <w:b w:val="0"/>
-                <w:i w:val="0"/>
-                <w:sz w:val="20"/>
-              </w:rPr>
-              <w:t>che_do_vung: null</w:t>
+              <w:t>Sai đuôi tệp, tệp rỗng, quá 4 GiB, ffprobe không đọc được, hộp vượt khung, chỉ số câu không tồn tại</w:t>
             </w:r>
           </w:p>
         </w:tc>
@@ -6361,7 +6352,7 @@
       <w:r>
         <w:drawing>
           <wp:inline xmlns:a="http://schemas.openxmlformats.org/drawingml/2006/main" xmlns:pic="http://schemas.openxmlformats.org/drawingml/2006/picture">
-            <wp:extent cx="5760000" cy="3160884"/>
+            <wp:extent cx="5760000" cy="3134668"/>
             <wp:docPr id="2" name="Picture 2"/>
             <wp:cNvGraphicFramePr>
               <a:graphicFrameLocks noChangeAspect="1"/>
@@ -6382,7 +6373,7 @@
                   <pic:spPr>
                     <a:xfrm>
                       <a:off x="0" y="0"/>
-                      <a:ext cx="5760000" cy="3160884"/>
+                      <a:ext cx="5760000" cy="3134668"/>
                     </a:xfrm>
                     <a:prstGeom prst="rect"/>
                   </pic:spPr>

</xml_diff>